<commit_message>
add a screenshot update word file
</commit_message>
<xml_diff>
--- a/New Microsoft Word Document.docx
+++ b/New Microsoft Word Document.docx
@@ -1041,6 +1041,31 @@
             <v:imagedata xmlns:r="http://schemas.openxmlformats.org/officeDocument/2006/relationships" r:id="docRId1" o:title=""/>
           </v:rect>
           <o:OLEObject xmlns:r="http://schemas.openxmlformats.org/officeDocument/2006/relationships" xmlns:o="urn:schemas-microsoft-com:office:office" Type="Embed" ProgID="StaticMetafile" DrawAspect="Content" ObjectID="0000000000" ShapeID="rectole0000000000" r:id="docRId0"/>
+        </w:object>
+      </w:r>
+    </w:p>
+    <w:p>
+      <w:pPr>
+        <w:spacing w:before="0" w:after="160" w:line="240"/>
+        <w:ind w:right="0" w:left="0" w:firstLine="0"/>
+        <w:jc w:val="left"/>
+        <w:rPr>
+          <w:rFonts w:ascii="Arial" w:hAnsi="Arial" w:cs="Arial" w:eastAsia="Arial"/>
+          <w:b/>
+          <w:color w:val="auto"/>
+          <w:spacing w:val="0"/>
+          <w:position w:val="0"/>
+          <w:sz w:val="32"/>
+          <w:shd w:fill="auto" w:val="clear"/>
+        </w:rPr>
+      </w:pPr>
+      <w:r>
+        <w:object w:dxaOrig="8310" w:dyaOrig="4245">
+          <v:rect xmlns:o="urn:schemas-microsoft-com:office:office" xmlns:v="urn:schemas-microsoft-com:vml" id="rectole0000000001" style="width:415.500000pt;height:212.250000pt" o:preferrelative="t" o:ole="">
+            <o:lock v:ext="edit"/>
+            <v:imagedata xmlns:r="http://schemas.openxmlformats.org/officeDocument/2006/relationships" r:id="docRId3" o:title=""/>
+          </v:rect>
+          <o:OLEObject xmlns:r="http://schemas.openxmlformats.org/officeDocument/2006/relationships" xmlns:o="urn:schemas-microsoft-com:office:office" Type="Embed" ProgID="StaticMetafile" DrawAspect="Content" ObjectID="0000000001" ShapeID="rectole0000000001" r:id="docRId2"/>
         </w:object>
       </w:r>
     </w:p>

</xml_diff>